<commit_message>
Add interactive VVR model subpage to Volcanology
</commit_message>
<xml_diff>
--- a/assets/cv/CV_Johan_Gilchrist_Winter_2026_no_in_prep.docx
+++ b/assets/cv/CV_Johan_Gilchrist_Winter_2026_no_in_prep.docx
@@ -75,6 +75,7 @@
         </w:rPr>
         <w:tab/>
       </w:r>
+      <w:proofErr w:type="gramStart"/>
       <w:r>
         <w:rPr>
           <w:rFonts w:ascii="Garamond" w:hAnsi="Garamond" w:cs="Times New Roman"/>
@@ -85,8 +86,16 @@
         <w:rPr>
           <w:rFonts w:ascii="Garamond" w:hAnsi="Garamond" w:cs="Times New Roman"/>
         </w:rPr>
-        <w:t xml:space="preserve">, 2017 – </w:t>
-      </w:r>
+        <w:t>,</w:t>
+      </w:r>
+      <w:proofErr w:type="gramEnd"/>
+      <w:r>
+        <w:rPr>
+          <w:rFonts w:ascii="Garamond" w:hAnsi="Garamond" w:cs="Times New Roman"/>
+        </w:rPr>
+        <w:t xml:space="preserve"> 2017 – </w:t>
+      </w:r>
+      <w:proofErr w:type="gramStart"/>
       <w:r>
         <w:rPr>
           <w:rFonts w:ascii="Garamond" w:hAnsi="Garamond" w:cs="Times New Roman"/>
@@ -97,7 +106,14 @@
         <w:rPr>
           <w:rFonts w:ascii="Garamond" w:hAnsi="Garamond" w:cs="Times New Roman"/>
         </w:rPr>
-        <w:t>, 2021</w:t>
+        <w:t>,</w:t>
+      </w:r>
+      <w:proofErr w:type="gramEnd"/>
+      <w:r>
+        <w:rPr>
+          <w:rFonts w:ascii="Garamond" w:hAnsi="Garamond" w:cs="Times New Roman"/>
+        </w:rPr>
+        <w:t xml:space="preserve"> 2021</w:t>
       </w:r>
     </w:p>
     <w:p>
@@ -331,6 +347,7 @@
         </w:rPr>
         <w:t xml:space="preserve"> 2015 – </w:t>
       </w:r>
+      <w:proofErr w:type="gramStart"/>
       <w:r>
         <w:rPr>
           <w:rFonts w:ascii="Garamond" w:hAnsi="Garamond" w:cs="Times New Roman"/>
@@ -341,7 +358,14 @@
         <w:rPr>
           <w:rFonts w:ascii="Garamond" w:hAnsi="Garamond" w:cs="Times New Roman"/>
         </w:rPr>
-        <w:t>, 2016</w:t>
+        <w:t>,</w:t>
+      </w:r>
+      <w:proofErr w:type="gramEnd"/>
+      <w:r>
+        <w:rPr>
+          <w:rFonts w:ascii="Garamond" w:hAnsi="Garamond" w:cs="Times New Roman"/>
+        </w:rPr>
+        <w:t xml:space="preserve"> 2016</w:t>
       </w:r>
     </w:p>
     <w:p>
@@ -415,6 +439,7 @@
         </w:rPr>
         <w:tab/>
       </w:r>
+      <w:proofErr w:type="gramStart"/>
       <w:r>
         <w:rPr>
           <w:rFonts w:ascii="Garamond" w:hAnsi="Garamond" w:cs="Times New Roman"/>
@@ -429,7 +454,16 @@
           <w:b w:val="0"/>
           <w:bCs w:val="0"/>
         </w:rPr>
-        <w:t xml:space="preserve">, 2010 </w:t>
+        <w:t>,</w:t>
+      </w:r>
+      <w:proofErr w:type="gramEnd"/>
+      <w:r>
+        <w:rPr>
+          <w:rFonts w:ascii="Garamond" w:hAnsi="Garamond" w:cs="Times New Roman"/>
+          <w:b w:val="0"/>
+          <w:bCs w:val="0"/>
+        </w:rPr>
+        <w:t xml:space="preserve"> 2010 </w:t>
       </w:r>
       <w:r>
         <w:rPr>
@@ -440,13 +474,23 @@
         </w:rPr>
         <w:t xml:space="preserve">– </w:t>
       </w:r>
-      <w:r>
-        <w:rPr>
-          <w:rFonts w:ascii="Garamond" w:hAnsi="Garamond" w:cs="Times New Roman"/>
-          <w:b w:val="0"/>
-          <w:bCs w:val="0"/>
-        </w:rPr>
-        <w:t>May, 2014</w:t>
+      <w:proofErr w:type="gramStart"/>
+      <w:r>
+        <w:rPr>
+          <w:rFonts w:ascii="Garamond" w:hAnsi="Garamond" w:cs="Times New Roman"/>
+          <w:b w:val="0"/>
+          <w:bCs w:val="0"/>
+        </w:rPr>
+        <w:t>May,</w:t>
+      </w:r>
+      <w:proofErr w:type="gramEnd"/>
+      <w:r>
+        <w:rPr>
+          <w:rFonts w:ascii="Garamond" w:hAnsi="Garamond" w:cs="Times New Roman"/>
+          <w:b w:val="0"/>
+          <w:bCs w:val="0"/>
+        </w:rPr>
+        <w:t xml:space="preserve"> 2014</w:t>
       </w:r>
     </w:p>
     <w:p>
@@ -1999,7 +2043,23 @@
           <w:rFonts w:ascii="Garamond" w:hAnsi="Garamond" w:cs="Times New Roman"/>
           <w:szCs w:val="20"/>
         </w:rPr>
-        <w:t>ral presentation at Cascades 2024 Workshop, Bend, OR, Aug 30.</w:t>
+        <w:t xml:space="preserve">ral presentation at Cascades 2024 Workshop, Bend, </w:t>
+      </w:r>
+      <w:proofErr w:type="gramStart"/>
+      <w:r>
+        <w:rPr>
+          <w:rFonts w:ascii="Garamond" w:hAnsi="Garamond" w:cs="Times New Roman"/>
+          <w:szCs w:val="20"/>
+        </w:rPr>
+        <w:t>OR,</w:t>
+      </w:r>
+      <w:proofErr w:type="gramEnd"/>
+      <w:r>
+        <w:rPr>
+          <w:rFonts w:ascii="Garamond" w:hAnsi="Garamond" w:cs="Times New Roman"/>
+          <w:szCs w:val="20"/>
+        </w:rPr>
+        <w:t xml:space="preserve"> Aug 30.</w:t>
       </w:r>
     </w:p>
     <w:p>
@@ -3163,6 +3223,7 @@
         </w:rPr>
         <w:tab/>
       </w:r>
+      <w:proofErr w:type="gramStart"/>
       <w:r>
         <w:rPr>
           <w:rFonts w:ascii="Garamond" w:hAnsi="Garamond" w:cs="Times New Roman"/>
@@ -3177,7 +3238,16 @@
           <w:b w:val="0"/>
           <w:bCs w:val="0"/>
         </w:rPr>
-        <w:t>, 2024 - Present</w:t>
+        <w:t>,</w:t>
+      </w:r>
+      <w:proofErr w:type="gramEnd"/>
+      <w:r>
+        <w:rPr>
+          <w:rFonts w:ascii="Garamond" w:hAnsi="Garamond" w:cs="Times New Roman"/>
+          <w:b w:val="0"/>
+          <w:bCs w:val="0"/>
+        </w:rPr>
+        <w:t xml:space="preserve"> 2024 - Present</w:t>
       </w:r>
     </w:p>
     <w:p>
@@ -3319,6 +3389,7 @@
         </w:rPr>
         <w:tab/>
       </w:r>
+      <w:proofErr w:type="gramStart"/>
       <w:r>
         <w:rPr>
           <w:rFonts w:ascii="Garamond" w:hAnsi="Garamond" w:cs="Times New Roman"/>
@@ -3333,7 +3404,16 @@
           <w:b w:val="0"/>
           <w:bCs w:val="0"/>
         </w:rPr>
-        <w:t xml:space="preserve">, 2022 </w:t>
+        <w:t>,</w:t>
+      </w:r>
+      <w:proofErr w:type="gramEnd"/>
+      <w:r>
+        <w:rPr>
+          <w:rFonts w:ascii="Garamond" w:hAnsi="Garamond" w:cs="Times New Roman"/>
+          <w:b w:val="0"/>
+          <w:bCs w:val="0"/>
+        </w:rPr>
+        <w:t xml:space="preserve"> 2022 </w:t>
       </w:r>
       <w:r>
         <w:rPr>
@@ -3351,6 +3431,7 @@
         </w:rPr>
         <w:t xml:space="preserve"> </w:t>
       </w:r>
+      <w:proofErr w:type="gramStart"/>
       <w:r>
         <w:rPr>
           <w:rFonts w:ascii="Garamond" w:hAnsi="Garamond" w:cs="Times New Roman"/>
@@ -3365,7 +3446,16 @@
           <w:b w:val="0"/>
           <w:bCs w:val="0"/>
         </w:rPr>
-        <w:t>, 2024</w:t>
+        <w:t>,</w:t>
+      </w:r>
+      <w:proofErr w:type="gramEnd"/>
+      <w:r>
+        <w:rPr>
+          <w:rFonts w:ascii="Garamond" w:hAnsi="Garamond" w:cs="Times New Roman"/>
+          <w:b w:val="0"/>
+          <w:bCs w:val="0"/>
+        </w:rPr>
+        <w:t xml:space="preserve"> 2024</w:t>
       </w:r>
     </w:p>
     <w:p>
@@ -3401,7 +3491,27 @@
           <w:i/>
           <w:iCs/>
         </w:rPr>
-        <w:t xml:space="preserve"> Operations, Newcrest Mining Ltd., Smithers, BC </w:t>
+        <w:t xml:space="preserve"> Operations, </w:t>
+      </w:r>
+      <w:r>
+        <w:rPr>
+          <w:rFonts w:ascii="Garamond" w:hAnsi="Garamond" w:cs="Times New Roman"/>
+          <w:b w:val="0"/>
+          <w:bCs w:val="0"/>
+          <w:i/>
+          <w:iCs/>
+        </w:rPr>
+        <w:t>Newmont Corporation</w:t>
+      </w:r>
+      <w:r>
+        <w:rPr>
+          <w:rFonts w:ascii="Garamond" w:hAnsi="Garamond" w:cs="Times New Roman"/>
+          <w:b w:val="0"/>
+          <w:bCs w:val="0"/>
+          <w:i/>
+          <w:iCs/>
+        </w:rPr>
+        <w:t xml:space="preserve">, Smithers, BC </w:t>
       </w:r>
       <w:r>
         <w:rPr>
@@ -3576,7 +3686,24 @@
           <w:bCs w:val="0"/>
         </w:rPr>
         <w:tab/>
-        <w:t>May, 2011</w:t>
+      </w:r>
+      <w:proofErr w:type="gramStart"/>
+      <w:r>
+        <w:rPr>
+          <w:rFonts w:ascii="Garamond" w:hAnsi="Garamond" w:cs="Times New Roman"/>
+          <w:b w:val="0"/>
+          <w:bCs w:val="0"/>
+        </w:rPr>
+        <w:t>May,</w:t>
+      </w:r>
+      <w:proofErr w:type="gramEnd"/>
+      <w:r>
+        <w:rPr>
+          <w:rFonts w:ascii="Garamond" w:hAnsi="Garamond" w:cs="Times New Roman"/>
+          <w:b w:val="0"/>
+          <w:bCs w:val="0"/>
+        </w:rPr>
+        <w:t xml:space="preserve"> 2011</w:t>
       </w:r>
       <w:r>
         <w:rPr>
@@ -3602,6 +3729,7 @@
         </w:rPr>
         <w:t xml:space="preserve"> </w:t>
       </w:r>
+      <w:proofErr w:type="gramStart"/>
       <w:r>
         <w:rPr>
           <w:rFonts w:ascii="Garamond" w:hAnsi="Garamond" w:cs="Times New Roman"/>
@@ -3616,7 +3744,16 @@
           <w:b w:val="0"/>
           <w:bCs w:val="0"/>
         </w:rPr>
-        <w:t>, 2015</w:t>
+        <w:t>,</w:t>
+      </w:r>
+      <w:proofErr w:type="gramEnd"/>
+      <w:r>
+        <w:rPr>
+          <w:rFonts w:ascii="Garamond" w:hAnsi="Garamond" w:cs="Times New Roman"/>
+          <w:b w:val="0"/>
+          <w:bCs w:val="0"/>
+        </w:rPr>
+        <w:t xml:space="preserve"> 2015</w:t>
       </w:r>
     </w:p>
     <w:p>
@@ -3659,6 +3796,7 @@
         </w:rPr>
         <w:tab/>
       </w:r>
+      <w:proofErr w:type="gramStart"/>
       <w:r>
         <w:rPr>
           <w:rFonts w:ascii="Garamond" w:hAnsi="Garamond" w:cs="Times New Roman"/>
@@ -3669,7 +3807,14 @@
         <w:rPr>
           <w:rFonts w:ascii="Garamond" w:hAnsi="Garamond" w:cs="Times New Roman"/>
         </w:rPr>
-        <w:t>, 2022</w:t>
+        <w:t>,</w:t>
+      </w:r>
+      <w:proofErr w:type="gramEnd"/>
+      <w:r>
+        <w:rPr>
+          <w:rFonts w:ascii="Garamond" w:hAnsi="Garamond" w:cs="Times New Roman"/>
+        </w:rPr>
+        <w:t xml:space="preserve"> 2022</w:t>
       </w:r>
       <w:r>
         <w:rPr>
@@ -3805,8 +3950,26 @@
           <w:bCs w:val="0"/>
         </w:rPr>
         <w:tab/>
-        <w:t xml:space="preserve">May, 2020 – </w:t>
-      </w:r>
+      </w:r>
+      <w:proofErr w:type="gramStart"/>
+      <w:r>
+        <w:rPr>
+          <w:rFonts w:ascii="Garamond" w:hAnsi="Garamond" w:cs="Times New Roman"/>
+          <w:b w:val="0"/>
+          <w:bCs w:val="0"/>
+        </w:rPr>
+        <w:t>May,</w:t>
+      </w:r>
+      <w:proofErr w:type="gramEnd"/>
+      <w:r>
+        <w:rPr>
+          <w:rFonts w:ascii="Garamond" w:hAnsi="Garamond" w:cs="Times New Roman"/>
+          <w:b w:val="0"/>
+          <w:bCs w:val="0"/>
+        </w:rPr>
+        <w:t xml:space="preserve"> 2020 – </w:t>
+      </w:r>
+      <w:proofErr w:type="gramStart"/>
       <w:r>
         <w:rPr>
           <w:rFonts w:ascii="Garamond" w:hAnsi="Garamond" w:cs="Times New Roman"/>
@@ -3821,7 +3984,16 @@
           <w:b w:val="0"/>
           <w:bCs w:val="0"/>
         </w:rPr>
-        <w:t>, 2022</w:t>
+        <w:t>,</w:t>
+      </w:r>
+      <w:proofErr w:type="gramEnd"/>
+      <w:r>
+        <w:rPr>
+          <w:rFonts w:ascii="Garamond" w:hAnsi="Garamond" w:cs="Times New Roman"/>
+          <w:b w:val="0"/>
+          <w:bCs w:val="0"/>
+        </w:rPr>
+        <w:t xml:space="preserve"> 2022</w:t>
       </w:r>
     </w:p>
     <w:p>
@@ -3963,7 +4135,21 @@
         <w:rPr>
           <w:rFonts w:ascii="Garamond" w:hAnsi="Garamond" w:cs="Times New Roman"/>
         </w:rPr>
-        <w:t>Supervision of undergraduate internships on carbon offset program ratings system for University members</w:t>
+        <w:t xml:space="preserve">Supervision of undergraduate internships on carbon offset program ratings system for </w:t>
+      </w:r>
+      <w:proofErr w:type="gramStart"/>
+      <w:r>
+        <w:rPr>
+          <w:rFonts w:ascii="Garamond" w:hAnsi="Garamond" w:cs="Times New Roman"/>
+        </w:rPr>
+        <w:t>University</w:t>
+      </w:r>
+      <w:proofErr w:type="gramEnd"/>
+      <w:r>
+        <w:rPr>
+          <w:rFonts w:ascii="Garamond" w:hAnsi="Garamond" w:cs="Times New Roman"/>
+        </w:rPr>
+        <w:t xml:space="preserve"> members</w:t>
       </w:r>
     </w:p>
     <w:p>
@@ -4072,6 +4258,7 @@
         </w:rPr>
         <w:t xml:space="preserve">– </w:t>
       </w:r>
+      <w:proofErr w:type="gramStart"/>
       <w:r>
         <w:rPr>
           <w:rFonts w:ascii="Garamond" w:hAnsi="Garamond" w:cs="Times New Roman"/>
@@ -4082,7 +4269,14 @@
         <w:rPr>
           <w:rFonts w:ascii="Garamond" w:hAnsi="Garamond" w:cs="Times New Roman"/>
         </w:rPr>
-        <w:t>, 2019</w:t>
+        <w:t>,</w:t>
+      </w:r>
+      <w:proofErr w:type="gramEnd"/>
+      <w:r>
+        <w:rPr>
+          <w:rFonts w:ascii="Garamond" w:hAnsi="Garamond" w:cs="Times New Roman"/>
+        </w:rPr>
+        <w:t xml:space="preserve"> 2019</w:t>
       </w:r>
     </w:p>
     <w:p>
@@ -5521,7 +5715,6 @@
               <w:b/>
               <w:bCs/>
             </w:rPr>
-            <w:lastRenderedPageBreak/>
             <w:t>Technical</w:t>
           </w:r>
           <w:r>
@@ -5786,6 +5979,7 @@
           <w:sz w:val="20"/>
           <w:szCs w:val="20"/>
         </w:rPr>
+        <w:lastRenderedPageBreak/>
         <w:t>Field</w:t>
       </w:r>
       <w:r>
@@ -12317,6 +12511,7 @@
     <w:rsid w:val="005B1403"/>
     <w:rsid w:val="00614D15"/>
     <w:rsid w:val="00624546"/>
+    <w:rsid w:val="006623A8"/>
     <w:rsid w:val="0074593E"/>
     <w:rsid w:val="0075546C"/>
     <w:rsid w:val="00895B3F"/>
@@ -12332,7 +12527,6 @@
     <w:rsid w:val="00B962BD"/>
     <w:rsid w:val="00BA5B6D"/>
     <w:rsid w:val="00BD6978"/>
-    <w:rsid w:val="00CA0355"/>
     <w:rsid w:val="00D856A4"/>
     <w:rsid w:val="00D9255B"/>
     <w:rsid w:val="00DC1005"/>

</xml_diff>